<commit_message>
All tasks completed for submission
</commit_message>
<xml_diff>
--- a/Assignment 2 (Python) - Student copy.docx
+++ b/Assignment 2 (Python) - Student copy.docx
@@ -345,21 +345,35 @@
         <w:rPr>
           <w:rFonts w:ascii="Barlow" w:eastAsia="Barlow" w:hAnsi="Barlow" w:cs="Barlow"/>
         </w:rPr>
-        <w:t xml:space="preserve"> repository, create a branch including the assignment number and title </w:t>
-      </w:r>
-      <w:proofErr w:type="spellStart"/>
-      <w:r>
-        <w:rPr>
-          <w:rFonts w:ascii="Barlow" w:eastAsia="Barlow" w:hAnsi="Barlow" w:cs="Barlow"/>
-        </w:rPr>
-        <w:t>eg</w:t>
-      </w:r>
-      <w:proofErr w:type="spellEnd"/>
-      <w:r>
-        <w:rPr>
-          <w:rFonts w:ascii="Barlow" w:eastAsia="Barlow" w:hAnsi="Barlow" w:cs="Barlow"/>
-        </w:rPr>
-        <w:t xml:space="preserve"> (assignment-2-python) where you will be adding your assignment work. </w:t>
+        <w:t xml:space="preserve"> repository, </w:t>
+      </w:r>
+      <w:r>
+        <w:rPr>
+          <w:rFonts w:ascii="Barlow" w:eastAsia="Barlow" w:hAnsi="Barlow" w:cs="Barlow"/>
+          <w:highlight w:val="yellow"/>
+        </w:rPr>
+        <w:t xml:space="preserve">create a </w:t>
+      </w:r>
+      <w:commentRangeStart w:id="0"/>
+      <w:r>
+        <w:rPr>
+          <w:rFonts w:ascii="Barlow" w:eastAsia="Barlow" w:hAnsi="Barlow" w:cs="Barlow"/>
+          <w:highlight w:val="yellow"/>
+        </w:rPr>
+        <w:t>branch</w:t>
+      </w:r>
+      <w:commentRangeEnd w:id="0"/>
+      <w:r>
+        <w:rPr>
+          <w:rStyle w:val="CommentReference"/>
+        </w:rPr>
+        <w:commentReference w:id="0"/>
+      </w:r>
+      <w:r>
+        <w:rPr>
+          <w:rFonts w:ascii="Barlow" w:eastAsia="Barlow" w:hAnsi="Barlow" w:cs="Barlow"/>
+        </w:rPr>
+        <w:t xml:space="preserve"> including the assignment number and title eg (assignment-2-python) where you will be adding your assignment work. </w:t>
       </w:r>
     </w:p>
     <w:p>
@@ -384,35 +398,7 @@
         <w:rPr>
           <w:rFonts w:ascii="Barlow" w:eastAsia="Barlow" w:hAnsi="Barlow" w:cs="Barlow"/>
         </w:rPr>
-        <w:t>You will need to commit your .</w:t>
-      </w:r>
-      <w:proofErr w:type="spellStart"/>
-      <w:r>
-        <w:rPr>
-          <w:rFonts w:ascii="Barlow" w:eastAsia="Barlow" w:hAnsi="Barlow" w:cs="Barlow"/>
-        </w:rPr>
-        <w:t>py</w:t>
-      </w:r>
-      <w:proofErr w:type="spellEnd"/>
-      <w:r>
-        <w:rPr>
-          <w:rFonts w:ascii="Barlow" w:eastAsia="Barlow" w:hAnsi="Barlow" w:cs="Barlow"/>
-        </w:rPr>
-        <w:t xml:space="preserve"> or .</w:t>
-      </w:r>
-      <w:proofErr w:type="spellStart"/>
-      <w:r>
-        <w:rPr>
-          <w:rFonts w:ascii="Barlow" w:eastAsia="Barlow" w:hAnsi="Barlow" w:cs="Barlow"/>
-        </w:rPr>
-        <w:t>sql</w:t>
-      </w:r>
-      <w:proofErr w:type="spellEnd"/>
-      <w:r>
-        <w:rPr>
-          <w:rFonts w:ascii="Barlow" w:eastAsia="Barlow" w:hAnsi="Barlow" w:cs="Barlow"/>
-        </w:rPr>
-        <w:t xml:space="preserve"> files to your assignment branch on GitHub.</w:t>
+        <w:t>You will need to commit your .py or .sql files to your assignment branch on GitHub.</w:t>
       </w:r>
     </w:p>
     <w:p>
@@ -750,7 +736,14 @@
         <w:rPr>
           <w:rFonts w:ascii="Barlow" w:eastAsia="Barlow" w:hAnsi="Barlow" w:cs="Barlow"/>
         </w:rPr>
-        <w:t>D. Creativity (5 marks)</w:t>
+        <w:t xml:space="preserve">D. </w:t>
+      </w:r>
+      <w:r>
+        <w:rPr>
+          <w:rFonts w:ascii="Barlow" w:eastAsia="Barlow" w:hAnsi="Barlow" w:cs="Barlow"/>
+          <w:highlight w:val="green"/>
+        </w:rPr>
+        <w:t>Creativity (5 marks)</w:t>
       </w:r>
     </w:p>
     <w:p>
@@ -795,7 +788,6 @@
         </w:rPr>
         <w:t xml:space="preserve">Use </w:t>
       </w:r>
-      <w:proofErr w:type="spellStart"/>
       <w:r>
         <w:rPr>
           <w:rFonts w:ascii="Barlow" w:eastAsia="Barlow" w:hAnsi="Barlow" w:cs="Barlow"/>
@@ -803,14 +795,12 @@
         </w:rPr>
         <w:t>boolean</w:t>
       </w:r>
-      <w:proofErr w:type="spellEnd"/>
       <w:r>
         <w:rPr>
           <w:rFonts w:ascii="Barlow" w:eastAsia="Barlow" w:hAnsi="Barlow" w:cs="Barlow"/>
         </w:rPr>
         <w:t xml:space="preserve"> values and </w:t>
       </w:r>
-      <w:proofErr w:type="spellStart"/>
       <w:r>
         <w:rPr>
           <w:rFonts w:ascii="Barlow" w:eastAsia="Barlow" w:hAnsi="Barlow" w:cs="Barlow"/>
@@ -818,7 +808,6 @@
         </w:rPr>
         <w:t>if..else</w:t>
       </w:r>
-      <w:proofErr w:type="spellEnd"/>
       <w:r>
         <w:rPr>
           <w:rFonts w:ascii="Barlow" w:eastAsia="Barlow" w:hAnsi="Barlow" w:cs="Barlow"/>
@@ -1022,21 +1011,7 @@
         <w:rPr>
           <w:rFonts w:ascii="Barlow" w:eastAsia="Barlow" w:hAnsi="Barlow" w:cs="Barlow"/>
         </w:rPr>
-        <w:t xml:space="preserve">to get some information as </w:t>
-      </w:r>
-      <w:proofErr w:type="spellStart"/>
-      <w:r>
-        <w:rPr>
-          <w:rFonts w:ascii="Barlow" w:eastAsia="Barlow" w:hAnsi="Barlow" w:cs="Barlow"/>
-        </w:rPr>
-        <w:t>json</w:t>
-      </w:r>
-      <w:proofErr w:type="spellEnd"/>
-      <w:r>
-        <w:rPr>
-          <w:rFonts w:ascii="Barlow" w:eastAsia="Barlow" w:hAnsi="Barlow" w:cs="Barlow"/>
-        </w:rPr>
-        <w:t>.</w:t>
+        <w:t>to get some information as json.</w:t>
       </w:r>
     </w:p>
     <w:p>
@@ -1182,7 +1157,7 @@
         </w:rPr>
         <w:t xml:space="preserve">'Open Notify' - </w:t>
       </w:r>
-      <w:hyperlink r:id="rId7">
+      <w:hyperlink r:id="rId11">
         <w:r>
           <w:rPr>
             <w:rFonts w:ascii="Barlow" w:eastAsia="Barlow" w:hAnsi="Barlow" w:cs="Barlow"/>
@@ -1218,25 +1193,9 @@
           <w:rFonts w:ascii="Barlow" w:eastAsia="Barlow" w:hAnsi="Barlow" w:cs="Barlow"/>
           <w:highlight w:val="white"/>
         </w:rPr>
-        <w:t>'</w:t>
-      </w:r>
-      <w:proofErr w:type="spellStart"/>
-      <w:r>
-        <w:rPr>
-          <w:rFonts w:ascii="Barlow" w:eastAsia="Barlow" w:hAnsi="Barlow" w:cs="Barlow"/>
-          <w:highlight w:val="white"/>
-        </w:rPr>
-        <w:t>Pokéapi</w:t>
-      </w:r>
-      <w:proofErr w:type="spellEnd"/>
-      <w:r>
-        <w:rPr>
-          <w:rFonts w:ascii="Barlow" w:eastAsia="Barlow" w:hAnsi="Barlow" w:cs="Barlow"/>
-          <w:highlight w:val="white"/>
-        </w:rPr>
-        <w:t xml:space="preserve">' - </w:t>
-      </w:r>
-      <w:hyperlink r:id="rId8">
+        <w:t xml:space="preserve">'Pokéapi' - </w:t>
+      </w:r>
+      <w:hyperlink r:id="rId12">
         <w:r>
           <w:rPr>
             <w:rFonts w:ascii="Barlow" w:eastAsia="Barlow" w:hAnsi="Barlow" w:cs="Barlow"/>
@@ -1273,7 +1232,7 @@
         </w:rPr>
         <w:t xml:space="preserve">‘Open Trivia Database’  - </w:t>
       </w:r>
-      <w:hyperlink r:id="rId9">
+      <w:hyperlink r:id="rId13">
         <w:r>
           <w:rPr>
             <w:rFonts w:ascii="Barlow" w:eastAsia="Barlow" w:hAnsi="Barlow" w:cs="Barlow"/>
@@ -1302,7 +1261,7 @@
         </w:rPr>
         <w:t xml:space="preserve">‘Open Weather - </w:t>
       </w:r>
-      <w:hyperlink r:id="rId10">
+      <w:hyperlink r:id="rId14">
         <w:r>
           <w:rPr>
             <w:rFonts w:ascii="Barlow" w:eastAsia="Barlow" w:hAnsi="Barlow" w:cs="Barlow"/>
@@ -1335,23 +1294,9 @@
         <w:rPr>
           <w:rFonts w:ascii="Barlow" w:eastAsia="Barlow" w:hAnsi="Barlow" w:cs="Barlow"/>
         </w:rPr>
-        <w:t>‘</w:t>
-      </w:r>
-      <w:proofErr w:type="spellStart"/>
-      <w:r>
-        <w:rPr>
-          <w:rFonts w:ascii="Barlow" w:eastAsia="Barlow" w:hAnsi="Barlow" w:cs="Barlow"/>
-        </w:rPr>
-        <w:t>MyAnimeList</w:t>
-      </w:r>
-      <w:proofErr w:type="spellEnd"/>
-      <w:r>
-        <w:rPr>
-          <w:rFonts w:ascii="Barlow" w:eastAsia="Barlow" w:hAnsi="Barlow" w:cs="Barlow"/>
-        </w:rPr>
-        <w:t xml:space="preserve">’ - </w:t>
-      </w:r>
-      <w:hyperlink r:id="rId11">
+        <w:t xml:space="preserve">‘MyAnimeList’ - </w:t>
+      </w:r>
+      <w:hyperlink r:id="rId15">
         <w:r>
           <w:rPr>
             <w:rFonts w:ascii="Barlow" w:eastAsia="Barlow" w:hAnsi="Barlow" w:cs="Barlow"/>
@@ -1387,7 +1332,7 @@
         </w:rPr>
         <w:t>‘Star Wars’ -  ​</w:t>
       </w:r>
-      <w:hyperlink r:id="rId12">
+      <w:hyperlink r:id="rId16">
         <w:r>
           <w:rPr>
             <w:rFonts w:ascii="Barlow" w:eastAsia="Barlow" w:hAnsi="Barlow" w:cs="Barlow"/>
@@ -1607,25 +1552,7 @@
           <w:b/>
           <w:bCs/>
         </w:rPr>
-        <w:t xml:space="preserve">uses the </w:t>
-      </w:r>
-      <w:proofErr w:type="spellStart"/>
-      <w:r>
-        <w:rPr>
-          <w:rFonts w:ascii="Barlow" w:hAnsi="Barlow"/>
-          <w:b/>
-          <w:bCs/>
-        </w:rPr>
-        <w:t>OpenWeather</w:t>
-      </w:r>
-      <w:proofErr w:type="spellEnd"/>
-      <w:r>
-        <w:rPr>
-          <w:rFonts w:ascii="Barlow" w:hAnsi="Barlow"/>
-          <w:b/>
-          <w:bCs/>
-        </w:rPr>
-        <w:t xml:space="preserve"> API</w:t>
+        <w:t>uses the OpenWeather API</w:t>
       </w:r>
       <w:r>
         <w:rPr>
@@ -1943,21 +1870,7 @@
         <w:rPr>
           <w:rFonts w:ascii="Barlow" w:hAnsi="Barlow"/>
         </w:rPr>
-        <w:t xml:space="preserve">Foggy (high humidity) – hydrating cleanser, gentle exfoliation, hydrating serums, lightweight moisturiser + </w:t>
-      </w:r>
-      <w:proofErr w:type="spellStart"/>
-      <w:r>
-        <w:rPr>
-          <w:rFonts w:ascii="Barlow" w:hAnsi="Barlow"/>
-        </w:rPr>
-        <w:t>uv</w:t>
-      </w:r>
-      <w:proofErr w:type="spellEnd"/>
-      <w:r>
-        <w:rPr>
-          <w:rFonts w:ascii="Barlow" w:hAnsi="Barlow"/>
-        </w:rPr>
-        <w:t xml:space="preserve"> protection.</w:t>
+        <w:t>Foggy (high humidity) – hydrating cleanser, gentle exfoliation, hydrating serums, lightweight moisturiser + uv protection.</w:t>
       </w:r>
     </w:p>
     <w:p>
@@ -1978,21 +1891,7 @@
         <w:rPr>
           <w:rFonts w:ascii="Barlow" w:hAnsi="Barlow"/>
         </w:rPr>
-        <w:t xml:space="preserve">Sunny – </w:t>
-      </w:r>
-      <w:proofErr w:type="spellStart"/>
-      <w:r>
-        <w:rPr>
-          <w:rFonts w:ascii="Barlow" w:hAnsi="Barlow"/>
-        </w:rPr>
-        <w:t>uv</w:t>
-      </w:r>
-      <w:proofErr w:type="spellEnd"/>
-      <w:r>
-        <w:rPr>
-          <w:rFonts w:ascii="Barlow" w:hAnsi="Barlow"/>
-        </w:rPr>
-        <w:t xml:space="preserve"> protection, cleansing and toning</w:t>
+        <w:t>Sunny – uv protection, cleansing and toning</w:t>
       </w:r>
     </w:p>
     <w:p>
@@ -2037,21 +1936,7 @@
         <w:rPr>
           <w:rFonts w:ascii="Barlow" w:hAnsi="Barlow"/>
         </w:rPr>
-        <w:t xml:space="preserve">hydrating serums, barrier repair serums, thick moisturiser + </w:t>
-      </w:r>
-      <w:proofErr w:type="spellStart"/>
-      <w:r>
-        <w:rPr>
-          <w:rFonts w:ascii="Barlow" w:hAnsi="Barlow"/>
-        </w:rPr>
-        <w:t>uv</w:t>
-      </w:r>
-      <w:proofErr w:type="spellEnd"/>
-      <w:r>
-        <w:rPr>
-          <w:rFonts w:ascii="Barlow" w:hAnsi="Barlow"/>
-        </w:rPr>
-        <w:t xml:space="preserve"> protection</w:t>
+        <w:t>hydrating serums, barrier repair serums, thick moisturiser + uv protection</w:t>
       </w:r>
       <w:r>
         <w:rPr>
@@ -2084,16 +1969,8 @@
         <w:rPr>
           <w:rFonts w:ascii="Barlow" w:hAnsi="Barlow"/>
         </w:rPr>
-        <w:t xml:space="preserve">, barrier repair </w:t>
-      </w:r>
-      <w:proofErr w:type="spellStart"/>
-      <w:r>
-        <w:rPr>
-          <w:rFonts w:ascii="Barlow" w:hAnsi="Barlow"/>
-        </w:rPr>
-        <w:t>seums</w:t>
-      </w:r>
-      <w:proofErr w:type="spellEnd"/>
+        <w:t>, barrier repair seums</w:t>
+      </w:r>
       <w:r>
         <w:rPr>
           <w:rFonts w:ascii="Barlow" w:hAnsi="Barlow"/>
@@ -2106,19 +1983,11 @@
         </w:rPr>
         <w:t xml:space="preserve"> + </w:t>
       </w:r>
-      <w:proofErr w:type="spellStart"/>
-      <w:r>
-        <w:rPr>
-          <w:rFonts w:ascii="Barlow" w:hAnsi="Barlow"/>
-        </w:rPr>
-        <w:t>uv</w:t>
-      </w:r>
-      <w:proofErr w:type="spellEnd"/>
-      <w:r>
-        <w:rPr>
-          <w:rFonts w:ascii="Barlow" w:hAnsi="Barlow"/>
-        </w:rPr>
-        <w:t xml:space="preserve"> protection</w:t>
+      <w:r>
+        <w:rPr>
+          <w:rFonts w:ascii="Barlow" w:hAnsi="Barlow"/>
+        </w:rPr>
+        <w:t>uv protection</w:t>
       </w:r>
       <w:r>
         <w:rPr>
@@ -2149,21 +2018,7 @@
         <w:rPr>
           <w:rFonts w:ascii="Barlow" w:hAnsi="Barlow"/>
         </w:rPr>
-        <w:t xml:space="preserve">moisturiser, </w:t>
-      </w:r>
-      <w:proofErr w:type="spellStart"/>
-      <w:r>
-        <w:rPr>
-          <w:rFonts w:ascii="Barlow" w:hAnsi="Barlow"/>
-        </w:rPr>
-        <w:t>uv</w:t>
-      </w:r>
-      <w:proofErr w:type="spellEnd"/>
-      <w:r>
-        <w:rPr>
-          <w:rFonts w:ascii="Barlow" w:hAnsi="Barlow"/>
-        </w:rPr>
-        <w:t xml:space="preserve"> protection + glow masks</w:t>
+        <w:t>moisturiser, uv protection + glow masks</w:t>
       </w:r>
     </w:p>
     <w:p>
@@ -2182,21 +2037,7 @@
         <w:rPr>
           <w:rFonts w:ascii="Barlow" w:hAnsi="Barlow"/>
         </w:rPr>
-        <w:t xml:space="preserve">Temperature – recommend hydrating products </w:t>
-      </w:r>
-      <w:proofErr w:type="spellStart"/>
-      <w:r>
-        <w:rPr>
-          <w:rFonts w:ascii="Barlow" w:hAnsi="Barlow"/>
-        </w:rPr>
-        <w:t>cor</w:t>
-      </w:r>
-      <w:proofErr w:type="spellEnd"/>
-      <w:r>
-        <w:rPr>
-          <w:rFonts w:ascii="Barlow" w:hAnsi="Barlow"/>
-        </w:rPr>
-        <w:t xml:space="preserve"> cold weather and oil control products for hot weather. </w:t>
+        <w:t xml:space="preserve">Temperature – recommend hydrating products cor cold weather and oil control products for hot weather. </w:t>
       </w:r>
     </w:p>
     <w:p>
@@ -2211,21 +2052,12 @@
           <w:bCs/>
         </w:rPr>
       </w:pPr>
-      <w:proofErr w:type="spellStart"/>
-      <w:r>
-        <w:rPr>
-          <w:rFonts w:ascii="Barlow" w:eastAsia="Barlow" w:hAnsi="Barlow" w:cs="Barlow"/>
-          <w:bCs/>
-        </w:rPr>
-        <w:t>Im</w:t>
-      </w:r>
-      <w:proofErr w:type="spellEnd"/>
-      <w:r>
-        <w:rPr>
-          <w:rFonts w:ascii="Barlow" w:eastAsia="Barlow" w:hAnsi="Barlow" w:cs="Barlow"/>
-          <w:bCs/>
-        </w:rPr>
-        <w:t xml:space="preserve"> not sure how recommendations should be structured. </w:t>
+      <w:r>
+        <w:rPr>
+          <w:rFonts w:ascii="Barlow" w:eastAsia="Barlow" w:hAnsi="Barlow" w:cs="Barlow"/>
+          <w:bCs/>
+        </w:rPr>
+        <w:t xml:space="preserve">Im not sure how recommendations should be structured. </w:t>
       </w:r>
     </w:p>
     <w:p>
@@ -2361,39 +2193,7 @@
           <w:rFonts w:ascii="Barlow" w:eastAsia="Barlow" w:hAnsi="Barlow" w:cs="Barlow"/>
           <w:bCs/>
         </w:rPr>
-        <w:t xml:space="preserve">I’m not sure if I would have time to customise recommendations </w:t>
-      </w:r>
-      <w:proofErr w:type="spellStart"/>
-      <w:r>
-        <w:rPr>
-          <w:rFonts w:ascii="Barlow" w:eastAsia="Barlow" w:hAnsi="Barlow" w:cs="Barlow"/>
-          <w:bCs/>
-        </w:rPr>
-        <w:t>futher</w:t>
-      </w:r>
-      <w:proofErr w:type="spellEnd"/>
-      <w:r>
-        <w:rPr>
-          <w:rFonts w:ascii="Barlow" w:eastAsia="Barlow" w:hAnsi="Barlow" w:cs="Barlow"/>
-          <w:bCs/>
-        </w:rPr>
-        <w:t xml:space="preserve"> based on skin type. If I did, the only difference would be lightweight sunscreen for oily skin during the summer, and rich moisturisers during the summer for dry skin with an optional missing spray to rehydrate. During the colder, harsher weathers the cleansers should be water based and hydrating for oily skin and creamy cleansers for dry skin. The </w:t>
-      </w:r>
-      <w:proofErr w:type="spellStart"/>
-      <w:r>
-        <w:rPr>
-          <w:rFonts w:ascii="Barlow" w:eastAsia="Barlow" w:hAnsi="Barlow" w:cs="Barlow"/>
-          <w:bCs/>
-        </w:rPr>
-        <w:t>oly</w:t>
-      </w:r>
-      <w:proofErr w:type="spellEnd"/>
-      <w:r>
-        <w:rPr>
-          <w:rFonts w:ascii="Barlow" w:eastAsia="Barlow" w:hAnsi="Barlow" w:cs="Barlow"/>
-          <w:bCs/>
-        </w:rPr>
-        <w:t xml:space="preserve"> skin also </w:t>
+        <w:t xml:space="preserve">I’m not sure if I would have time to customise recommendations futher based on skin type. If I did, the only difference would be lightweight sunscreen for oily skin during the summer, and rich moisturisers during the summer for dry skin with an optional missing spray to rehydrate. During the colder, harsher weathers the cleansers should be water based and hydrating for oily skin and creamy cleansers for dry skin. The oly skin also </w:t>
       </w:r>
       <w:r>
         <w:rPr>
@@ -2492,14 +2292,7 @@
           <w:rFonts w:ascii="Barlow" w:eastAsia="Barlow" w:hAnsi="Barlow" w:cs="Barlow"/>
           <w:bCs/>
         </w:rPr>
-        <w:t xml:space="preserve">The app should </w:t>
-      </w:r>
-      <w:r>
-        <w:rPr>
-          <w:rFonts w:ascii="Barlow" w:eastAsia="Barlow" w:hAnsi="Barlow" w:cs="Barlow"/>
-          <w:bCs/>
-        </w:rPr>
-        <w:t>follow these guidelines:</w:t>
+        <w:t>The app should follow these guidelines:</w:t>
       </w:r>
     </w:p>
     <w:p>
@@ -2958,6 +2751,130 @@
           <w:bCs/>
         </w:rPr>
         <w:t>Save results to a .txt file.</w:t>
+      </w:r>
+    </w:p>
+    <w:p/>
+    <w:p/>
+    <w:p>
+      <w:r>
+        <w:t>The .txt file is used to store the output of the program so the user can refer to their skincare recommendations.</w:t>
+      </w:r>
+    </w:p>
+    <w:p/>
+    <w:p>
+      <w:r>
+        <w:t>Each time a user runs the app, the .txt file should:</w:t>
+      </w:r>
+    </w:p>
+    <w:p>
+      <w:pPr>
+        <w:pStyle w:val="ListParagraph"/>
+        <w:numPr>
+          <w:ilvl w:val="0"/>
+          <w:numId w:val="6"/>
+        </w:numPr>
+        <w:rPr>
+          <w:rFonts w:ascii="Barlow" w:eastAsia="Barlow" w:hAnsi="Barlow" w:cs="Barlow"/>
+          <w:bCs/>
+        </w:rPr>
+      </w:pPr>
+      <w:r>
+        <w:t>Log the user’s city and skin type</w:t>
+      </w:r>
+    </w:p>
+    <w:p>
+      <w:pPr>
+        <w:pStyle w:val="ListParagraph"/>
+        <w:numPr>
+          <w:ilvl w:val="0"/>
+          <w:numId w:val="6"/>
+        </w:numPr>
+        <w:rPr>
+          <w:rFonts w:ascii="Barlow" w:eastAsia="Barlow" w:hAnsi="Barlow" w:cs="Barlow"/>
+          <w:bCs/>
+        </w:rPr>
+      </w:pPr>
+      <w:r>
+        <w:t>Log the weather data retrieved from the API</w:t>
+      </w:r>
+    </w:p>
+    <w:p>
+      <w:pPr>
+        <w:pStyle w:val="ListParagraph"/>
+        <w:numPr>
+          <w:ilvl w:val="0"/>
+          <w:numId w:val="6"/>
+        </w:numPr>
+        <w:rPr>
+          <w:rFonts w:ascii="Barlow" w:eastAsia="Barlow" w:hAnsi="Barlow" w:cs="Barlow"/>
+          <w:bCs/>
+        </w:rPr>
+      </w:pPr>
+      <w:r>
+        <w:t xml:space="preserve">Log the final skincare recommendations. </w:t>
+      </w:r>
+    </w:p>
+    <w:p/>
+    <w:p>
+      <w:pPr>
+        <w:rPr>
+          <w:rFonts w:ascii="Barlow" w:eastAsia="Barlow" w:hAnsi="Barlow" w:cs="Barlow"/>
+          <w:bCs/>
+        </w:rPr>
+      </w:pPr>
+      <w:r>
+        <w:rPr>
+          <w:noProof/>
+        </w:rPr>
+        <w:lastRenderedPageBreak/>
+        <w:drawing>
+          <wp:inline distT="0" distB="0" distL="0" distR="0" wp14:anchorId="25F96384" wp14:editId="2BA33D6C">
+            <wp:extent cx="5730240" cy="4267200"/>
+            <wp:effectExtent l="0" t="0" r="3810" b="0"/>
+            <wp:docPr id="308769684" name="Picture 1"/>
+            <wp:cNvGraphicFramePr>
+              <a:graphicFrameLocks xmlns:a="http://schemas.openxmlformats.org/drawingml/2006/main" noChangeAspect="1"/>
+            </wp:cNvGraphicFramePr>
+            <a:graphic xmlns:a="http://schemas.openxmlformats.org/drawingml/2006/main">
+              <a:graphicData uri="http://schemas.openxmlformats.org/drawingml/2006/picture">
+                <pic:pic xmlns:pic="http://schemas.openxmlformats.org/drawingml/2006/picture">
+                  <pic:nvPicPr>
+                    <pic:cNvPr id="0" name="Picture 1"/>
+                    <pic:cNvPicPr>
+                      <a:picLocks noChangeAspect="1" noChangeArrowheads="1"/>
+                    </pic:cNvPicPr>
+                  </pic:nvPicPr>
+                  <pic:blipFill>
+                    <a:blip r:embed="rId17">
+                      <a:extLst>
+                        <a:ext uri="{28A0092B-C50C-407E-A947-70E740481C1C}">
+                          <a14:useLocalDpi xmlns:a14="http://schemas.microsoft.com/office/drawing/2010/main" val="0"/>
+                        </a:ext>
+                      </a:extLst>
+                    </a:blip>
+                    <a:srcRect/>
+                    <a:stretch>
+                      <a:fillRect/>
+                    </a:stretch>
+                  </pic:blipFill>
+                  <pic:spPr bwMode="auto">
+                    <a:xfrm>
+                      <a:off x="0" y="0"/>
+                      <a:ext cx="5730240" cy="4267200"/>
+                    </a:xfrm>
+                    <a:prstGeom prst="rect">
+                      <a:avLst/>
+                    </a:prstGeom>
+                    <a:noFill/>
+                    <a:ln>
+                      <a:noFill/>
+                    </a:ln>
+                  </pic:spPr>
+                </pic:pic>
+              </a:graphicData>
+            </a:graphic>
+          </wp:inline>
+        </w:drawing>
       </w:r>
       <w:r>
         <w:br w:type="page"/>
@@ -2981,6 +2898,45 @@
     </w:sectPr>
   </w:body>
 </w:document>
+</file>
+
+<file path=word/comments.xml><?xml version="1.0" encoding="utf-8"?>
+<w:comments xmlns:wpc="http://schemas.microsoft.com/office/word/2010/wordprocessingCanvas" xmlns:cx="http://schemas.microsoft.com/office/drawing/2014/chartex" xmlns:cx1="http://schemas.microsoft.com/office/drawing/2015/9/8/chartex" xmlns:cx2="http://schemas.microsoft.com/office/drawing/2015/10/21/chartex" xmlns:cx3="http://schemas.microsoft.com/office/drawing/2016/5/9/chartex" xmlns:cx4="http://schemas.microsoft.com/office/drawing/2016/5/10/chartex" xmlns:cx5="http://schemas.microsoft.com/office/drawing/2016/5/11/chartex" xmlns:cx6="http://schemas.microsoft.com/office/drawing/2016/5/12/chartex" xmlns:cx7="http://schemas.microsoft.com/office/drawing/2016/5/13/chartex" xmlns:cx8="http://schemas.microsoft.com/office/drawing/2016/5/14/chartex" xmlns:mc="http://schemas.openxmlformats.org/markup-compatibility/2006" xmlns:aink="http://schemas.microsoft.com/office/drawing/2016/ink" xmlns:am3d="http://schemas.microsoft.com/office/drawing/2017/model3d" xmlns:o="urn:schemas-microsoft-com:office:office" xmlns:oel="http://schemas.microsoft.com/office/2019/extlst" xmlns:r="http://schemas.openxmlformats.org/officeDocument/2006/relationships" xmlns:m="http://schemas.openxmlformats.org/officeDocument/2006/math" xmlns:v="urn:schemas-microsoft-com:vml" xmlns:wp14="http://schemas.microsoft.com/office/word/2010/wordprocessingDrawing" xmlns:wp="http://schemas.openxmlformats.org/drawingml/2006/wordprocessingDrawing" xmlns:w10="urn:schemas-microsoft-com:office:word" xmlns:w="http://schemas.openxmlformats.org/wordprocessingml/2006/main" xmlns:w14="http://schemas.microsoft.com/office/word/2010/wordml" xmlns:w15="http://schemas.microsoft.com/office/word/2012/wordml" xmlns:w16cex="http://schemas.microsoft.com/office/word/2018/wordml/cex" xmlns:w16cid="http://schemas.microsoft.com/office/word/2016/wordml/cid" xmlns:w16="http://schemas.microsoft.com/office/word/2018/wordml" xmlns:w16du="http://schemas.microsoft.com/office/word/2023/wordml/word16du" xmlns:w16sdtdh="http://schemas.microsoft.com/office/word/2020/wordml/sdtdatahash" xmlns:w16sdtfl="http://schemas.microsoft.com/office/word/2024/wordml/sdtformatlock" xmlns:w16se="http://schemas.microsoft.com/office/word/2015/wordml/symex" xmlns:wpg="http://schemas.microsoft.com/office/word/2010/wordprocessingGroup" xmlns:wpi="http://schemas.microsoft.com/office/word/2010/wordprocessingInk" xmlns:wne="http://schemas.microsoft.com/office/word/2006/wordml" xmlns:wps="http://schemas.microsoft.com/office/word/2010/wordprocessingShape" mc:Ignorable="w14 w15 w16se w16cid w16 w16cex w16sdtdh w16sdtfl w16du wp14">
+  <w:comment w:id="0" w:author="Brinel Ndombele" w:date="2025-02-08T14:24:00Z" w:initials="BN">
+    <w:p>
+      <w:pPr>
+        <w:pStyle w:val="CommentText"/>
+      </w:pPr>
+      <w:r>
+        <w:rPr>
+          <w:rStyle w:val="CommentReference"/>
+        </w:rPr>
+        <w:annotationRef/>
+      </w:r>
+      <w:r>
+        <w:t>Initialise a repo.</w:t>
+      </w:r>
+    </w:p>
+  </w:comment>
+</w:comments>
+</file>
+
+<file path=word/commentsExtended.xml><?xml version="1.0" encoding="utf-8"?>
+<w15:commentsEx xmlns:wpc="http://schemas.microsoft.com/office/word/2010/wordprocessingCanvas" xmlns:cx="http://schemas.microsoft.com/office/drawing/2014/chartex" xmlns:cx1="http://schemas.microsoft.com/office/drawing/2015/9/8/chartex" xmlns:cx2="http://schemas.microsoft.com/office/drawing/2015/10/21/chartex" xmlns:cx3="http://schemas.microsoft.com/office/drawing/2016/5/9/chartex" xmlns:cx4="http://schemas.microsoft.com/office/drawing/2016/5/10/chartex" xmlns:cx5="http://schemas.microsoft.com/office/drawing/2016/5/11/chartex" xmlns:cx6="http://schemas.microsoft.com/office/drawing/2016/5/12/chartex" xmlns:cx7="http://schemas.microsoft.com/office/drawing/2016/5/13/chartex" xmlns:cx8="http://schemas.microsoft.com/office/drawing/2016/5/14/chartex" xmlns:mc="http://schemas.openxmlformats.org/markup-compatibility/2006" xmlns:aink="http://schemas.microsoft.com/office/drawing/2016/ink" xmlns:am3d="http://schemas.microsoft.com/office/drawing/2017/model3d" xmlns:o="urn:schemas-microsoft-com:office:office" xmlns:oel="http://schemas.microsoft.com/office/2019/extlst" xmlns:r="http://schemas.openxmlformats.org/officeDocument/2006/relationships" xmlns:m="http://schemas.openxmlformats.org/officeDocument/2006/math" xmlns:v="urn:schemas-microsoft-com:vml" xmlns:wp14="http://schemas.microsoft.com/office/word/2010/wordprocessingDrawing" xmlns:wp="http://schemas.openxmlformats.org/drawingml/2006/wordprocessingDrawing" xmlns:w10="urn:schemas-microsoft-com:office:word" xmlns:w="http://schemas.openxmlformats.org/wordprocessingml/2006/main" xmlns:w14="http://schemas.microsoft.com/office/word/2010/wordml" xmlns:w15="http://schemas.microsoft.com/office/word/2012/wordml" xmlns:w16cex="http://schemas.microsoft.com/office/word/2018/wordml/cex" xmlns:w16cid="http://schemas.microsoft.com/office/word/2016/wordml/cid" xmlns:w16="http://schemas.microsoft.com/office/word/2018/wordml" xmlns:w16du="http://schemas.microsoft.com/office/word/2023/wordml/word16du" xmlns:w16sdtdh="http://schemas.microsoft.com/office/word/2020/wordml/sdtdatahash" xmlns:w16sdtfl="http://schemas.microsoft.com/office/word/2024/wordml/sdtformatlock" xmlns:w16se="http://schemas.microsoft.com/office/word/2015/wordml/symex" xmlns:wpg="http://schemas.microsoft.com/office/word/2010/wordprocessingGroup" xmlns:wpi="http://schemas.microsoft.com/office/word/2010/wordprocessingInk" xmlns:wne="http://schemas.microsoft.com/office/word/2006/wordml" xmlns:wps="http://schemas.microsoft.com/office/word/2010/wordprocessingShape" mc:Ignorable="w14 w15 w16se w16cid w16 w16cex w16sdtdh w16sdtfl w16du wp14">
+  <w15:commentEx w15:paraId="21172557" w15:done="0"/>
+</w15:commentsEx>
+</file>
+
+<file path=word/commentsExtensible.xml><?xml version="1.0" encoding="utf-8"?>
+<w16cex:commentsExtensible xmlns:wpc="http://schemas.microsoft.com/office/word/2010/wordprocessingCanvas" xmlns:cx="http://schemas.microsoft.com/office/drawing/2014/chartex" xmlns:cx1="http://schemas.microsoft.com/office/drawing/2015/9/8/chartex" xmlns:cx2="http://schemas.microsoft.com/office/drawing/2015/10/21/chartex" xmlns:cx3="http://schemas.microsoft.com/office/drawing/2016/5/9/chartex" xmlns:cx4="http://schemas.microsoft.com/office/drawing/2016/5/10/chartex" xmlns:cx5="http://schemas.microsoft.com/office/drawing/2016/5/11/chartex" xmlns:cx6="http://schemas.microsoft.com/office/drawing/2016/5/12/chartex" xmlns:cx7="http://schemas.microsoft.com/office/drawing/2016/5/13/chartex" xmlns:cx8="http://schemas.microsoft.com/office/drawing/2016/5/14/chartex" xmlns:cr="http://schemas.microsoft.com/office/comments/2020/reactions" xmlns:mc="http://schemas.openxmlformats.org/markup-compatibility/2006" xmlns:aink="http://schemas.microsoft.com/office/drawing/2016/ink" xmlns:am3d="http://schemas.microsoft.com/office/drawing/2017/model3d" xmlns:o="urn:schemas-microsoft-com:office:office" xmlns:oel="http://schemas.microsoft.com/office/2019/extlst" xmlns:r="http://schemas.openxmlformats.org/officeDocument/2006/relationships" xmlns:m="http://schemas.openxmlformats.org/officeDocument/2006/math" xmlns:v="urn:schemas-microsoft-com:vml" xmlns:wp14="http://schemas.microsoft.com/office/word/2010/wordprocessingDrawing" xmlns:wp="http://schemas.openxmlformats.org/drawingml/2006/wordprocessingDrawing" xmlns:w10="urn:schemas-microsoft-com:office:word" xmlns:w="http://schemas.openxmlformats.org/wordprocessingml/2006/main" xmlns:w14="http://schemas.microsoft.com/office/word/2010/wordml" xmlns:w15="http://schemas.microsoft.com/office/word/2012/wordml" xmlns:w16cex="http://schemas.microsoft.com/office/word/2018/wordml/cex" xmlns:w16cid="http://schemas.microsoft.com/office/word/2016/wordml/cid" xmlns:w16="http://schemas.microsoft.com/office/word/2018/wordml" xmlns:w16du="http://schemas.microsoft.com/office/word/2023/wordml/word16du" xmlns:w16sdtdh="http://schemas.microsoft.com/office/word/2020/wordml/sdtdatahash" xmlns:w16sdtfl="http://schemas.microsoft.com/office/word/2024/wordml/sdtformatlock" xmlns:w16se="http://schemas.microsoft.com/office/word/2015/wordml/symex" xmlns:wpg="http://schemas.microsoft.com/office/word/2010/wordprocessingGroup" xmlns:wpi="http://schemas.microsoft.com/office/word/2010/wordprocessingInk" xmlns:wne="http://schemas.microsoft.com/office/word/2006/wordml" xmlns:wps="http://schemas.microsoft.com/office/word/2010/wordprocessingShape" mc:Ignorable="w14 w15 w16se w16cid w16 w16cex w16sdtdh w16sdtfl cr w16du wp14">
+  <w16cex:commentExtensible w16cex:durableId="59026500" w16cex:dateUtc="2025-02-08T14:24:00Z"/>
+</w16cex:commentsExtensible>
+</file>
+
+<file path=word/commentsIds.xml><?xml version="1.0" encoding="utf-8"?>
+<w16cid:commentsIds xmlns:wpc="http://schemas.microsoft.com/office/word/2010/wordprocessingCanvas" xmlns:cx="http://schemas.microsoft.com/office/drawing/2014/chartex" xmlns:cx1="http://schemas.microsoft.com/office/drawing/2015/9/8/chartex" xmlns:cx2="http://schemas.microsoft.com/office/drawing/2015/10/21/chartex" xmlns:cx3="http://schemas.microsoft.com/office/drawing/2016/5/9/chartex" xmlns:cx4="http://schemas.microsoft.com/office/drawing/2016/5/10/chartex" xmlns:cx5="http://schemas.microsoft.com/office/drawing/2016/5/11/chartex" xmlns:cx6="http://schemas.microsoft.com/office/drawing/2016/5/12/chartex" xmlns:cx7="http://schemas.microsoft.com/office/drawing/2016/5/13/chartex" xmlns:cx8="http://schemas.microsoft.com/office/drawing/2016/5/14/chartex" xmlns:mc="http://schemas.openxmlformats.org/markup-compatibility/2006" xmlns:aink="http://schemas.microsoft.com/office/drawing/2016/ink" xmlns:am3d="http://schemas.microsoft.com/office/drawing/2017/model3d" xmlns:o="urn:schemas-microsoft-com:office:office" xmlns:oel="http://schemas.microsoft.com/office/2019/extlst" xmlns:r="http://schemas.openxmlformats.org/officeDocument/2006/relationships" xmlns:m="http://schemas.openxmlformats.org/officeDocument/2006/math" xmlns:v="urn:schemas-microsoft-com:vml" xmlns:wp14="http://schemas.microsoft.com/office/word/2010/wordprocessingDrawing" xmlns:wp="http://schemas.openxmlformats.org/drawingml/2006/wordprocessingDrawing" xmlns:w10="urn:schemas-microsoft-com:office:word" xmlns:w="http://schemas.openxmlformats.org/wordprocessingml/2006/main" xmlns:w14="http://schemas.microsoft.com/office/word/2010/wordml" xmlns:w15="http://schemas.microsoft.com/office/word/2012/wordml" xmlns:w16cex="http://schemas.microsoft.com/office/word/2018/wordml/cex" xmlns:w16cid="http://schemas.microsoft.com/office/word/2016/wordml/cid" xmlns:w16="http://schemas.microsoft.com/office/word/2018/wordml" xmlns:w16du="http://schemas.microsoft.com/office/word/2023/wordml/word16du" xmlns:w16sdtdh="http://schemas.microsoft.com/office/word/2020/wordml/sdtdatahash" xmlns:w16sdtfl="http://schemas.microsoft.com/office/word/2024/wordml/sdtformatlock" xmlns:w16se="http://schemas.microsoft.com/office/word/2015/wordml/symex" xmlns:wpg="http://schemas.microsoft.com/office/word/2010/wordprocessingGroup" xmlns:wpi="http://schemas.microsoft.com/office/word/2010/wordprocessingInk" xmlns:wne="http://schemas.microsoft.com/office/word/2006/wordml" xmlns:wps="http://schemas.microsoft.com/office/word/2010/wordprocessingShape" mc:Ignorable="w14 w15 w16se w16cid w16 w16cex w16sdtdh w16sdtfl w16du wp14">
+  <w16cid:commentId w16cid:paraId="21172557" w16cid:durableId="59026500"/>
+</w16cid:commentsIds>
 </file>
 
 <file path=word/numbering.xml><?xml version="1.0" encoding="utf-8"?>
@@ -3924,6 +3880,14 @@
     <w:abstractNumId w:val="3"/>
   </w:num>
 </w:numbering>
+</file>
+
+<file path=word/people.xml><?xml version="1.0" encoding="utf-8"?>
+<w15:people xmlns:wpc="http://schemas.microsoft.com/office/word/2010/wordprocessingCanvas" xmlns:cx="http://schemas.microsoft.com/office/drawing/2014/chartex" xmlns:cx1="http://schemas.microsoft.com/office/drawing/2015/9/8/chartex" xmlns:cx2="http://schemas.microsoft.com/office/drawing/2015/10/21/chartex" xmlns:cx3="http://schemas.microsoft.com/office/drawing/2016/5/9/chartex" xmlns:cx4="http://schemas.microsoft.com/office/drawing/2016/5/10/chartex" xmlns:cx5="http://schemas.microsoft.com/office/drawing/2016/5/11/chartex" xmlns:cx6="http://schemas.microsoft.com/office/drawing/2016/5/12/chartex" xmlns:cx7="http://schemas.microsoft.com/office/drawing/2016/5/13/chartex" xmlns:cx8="http://schemas.microsoft.com/office/drawing/2016/5/14/chartex" xmlns:mc="http://schemas.openxmlformats.org/markup-compatibility/2006" xmlns:aink="http://schemas.microsoft.com/office/drawing/2016/ink" xmlns:am3d="http://schemas.microsoft.com/office/drawing/2017/model3d" xmlns:o="urn:schemas-microsoft-com:office:office" xmlns:oel="http://schemas.microsoft.com/office/2019/extlst" xmlns:r="http://schemas.openxmlformats.org/officeDocument/2006/relationships" xmlns:m="http://schemas.openxmlformats.org/officeDocument/2006/math" xmlns:v="urn:schemas-microsoft-com:vml" xmlns:wp14="http://schemas.microsoft.com/office/word/2010/wordprocessingDrawing" xmlns:wp="http://schemas.openxmlformats.org/drawingml/2006/wordprocessingDrawing" xmlns:w10="urn:schemas-microsoft-com:office:word" xmlns:w="http://schemas.openxmlformats.org/wordprocessingml/2006/main" xmlns:w14="http://schemas.microsoft.com/office/word/2010/wordml" xmlns:w15="http://schemas.microsoft.com/office/word/2012/wordml" xmlns:w16cex="http://schemas.microsoft.com/office/word/2018/wordml/cex" xmlns:w16cid="http://schemas.microsoft.com/office/word/2016/wordml/cid" xmlns:w16="http://schemas.microsoft.com/office/word/2018/wordml" xmlns:w16du="http://schemas.microsoft.com/office/word/2023/wordml/word16du" xmlns:w16sdtdh="http://schemas.microsoft.com/office/word/2020/wordml/sdtdatahash" xmlns:w16sdtfl="http://schemas.microsoft.com/office/word/2024/wordml/sdtformatlock" xmlns:w16se="http://schemas.microsoft.com/office/word/2015/wordml/symex" xmlns:wpg="http://schemas.microsoft.com/office/word/2010/wordprocessingGroup" xmlns:wpi="http://schemas.microsoft.com/office/word/2010/wordprocessingInk" xmlns:wne="http://schemas.microsoft.com/office/word/2006/wordml" xmlns:wps="http://schemas.microsoft.com/office/word/2010/wordprocessingShape" mc:Ignorable="w14 w15 w16se w16cid w16 w16cex w16sdtdh w16sdtfl w16du wp14">
+  <w15:person w15:author="Brinel Ndombele">
+    <w15:presenceInfo w15:providerId="AD" w15:userId="S::bnnn2@kent.ac.uk::e543ed18-908f-4a56-ade5-30d055426a8c"/>
+  </w15:person>
+</w15:people>
 </file>
 
 <file path=word/styles.xml><?xml version="1.0" encoding="utf-8"?>
@@ -4441,6 +4405,7 @@
   <w:style w:type="character" w:default="1" w:styleId="DefaultParagraphFont">
     <w:name w:val="Default Paragraph Font"/>
     <w:uiPriority w:val="1"/>
+    <w:semiHidden/>
     <w:unhideWhenUsed/>
   </w:style>
   <w:style w:type="table" w:default="1" w:styleId="TableNormal">
@@ -4507,6 +4472,72 @@
       <w:ind w:left="720"/>
       <w:contextualSpacing/>
     </w:pPr>
+  </w:style>
+  <w:style w:type="character" w:styleId="CommentReference">
+    <w:name w:val="annotation reference"/>
+    <w:basedOn w:val="DefaultParagraphFont"/>
+    <w:uiPriority w:val="99"/>
+    <w:semiHidden/>
+    <w:unhideWhenUsed/>
+    <w:rsid w:val="00D677F3"/>
+    <w:rPr>
+      <w:sz w:val="16"/>
+      <w:szCs w:val="16"/>
+    </w:rPr>
+  </w:style>
+  <w:style w:type="paragraph" w:styleId="CommentText">
+    <w:name w:val="annotation text"/>
+    <w:basedOn w:val="Normal"/>
+    <w:link w:val="CommentTextChar"/>
+    <w:uiPriority w:val="99"/>
+    <w:unhideWhenUsed/>
+    <w:rsid w:val="00D677F3"/>
+    <w:pPr>
+      <w:spacing w:line="240" w:lineRule="auto"/>
+    </w:pPr>
+    <w:rPr>
+      <w:sz w:val="20"/>
+      <w:szCs w:val="20"/>
+    </w:rPr>
+  </w:style>
+  <w:style w:type="character" w:customStyle="1" w:styleId="CommentTextChar">
+    <w:name w:val="Comment Text Char"/>
+    <w:basedOn w:val="DefaultParagraphFont"/>
+    <w:link w:val="CommentText"/>
+    <w:uiPriority w:val="99"/>
+    <w:rsid w:val="00D677F3"/>
+    <w:rPr>
+      <w:sz w:val="20"/>
+      <w:szCs w:val="20"/>
+    </w:rPr>
+  </w:style>
+  <w:style w:type="paragraph" w:styleId="CommentSubject">
+    <w:name w:val="annotation subject"/>
+    <w:basedOn w:val="CommentText"/>
+    <w:next w:val="CommentText"/>
+    <w:link w:val="CommentSubjectChar"/>
+    <w:uiPriority w:val="99"/>
+    <w:semiHidden/>
+    <w:unhideWhenUsed/>
+    <w:rsid w:val="00D677F3"/>
+    <w:rPr>
+      <w:b/>
+      <w:bCs/>
+    </w:rPr>
+  </w:style>
+  <w:style w:type="character" w:customStyle="1" w:styleId="CommentSubjectChar">
+    <w:name w:val="Comment Subject Char"/>
+    <w:basedOn w:val="CommentTextChar"/>
+    <w:link w:val="CommentSubject"/>
+    <w:uiPriority w:val="99"/>
+    <w:semiHidden/>
+    <w:rsid w:val="00D677F3"/>
+    <w:rPr>
+      <w:b/>
+      <w:bCs/>
+      <w:sz w:val="20"/>
+      <w:szCs w:val="20"/>
+    </w:rPr>
   </w:style>
 </w:styles>
 </file>

</xml_diff>